<commit_message>
docs(manual): update operator/user manual docx
</commit_message>
<xml_diff>
--- a/docs/manual/HeatingCameraSystem_운영자매뉴얼.docx
+++ b/docs/manual/HeatingCameraSystem_운영자매뉴얼.docx
@@ -374,7 +374,7 @@
       <w:r>
         <w:fldChar w:fldCharType="separate"/>
       </w:r>
-      <w:hyperlink w:anchor="_Toc236979466" w:history="1">
+      <w:hyperlink w:anchor="_Toc236986412" w:history="1">
         <w:r>
           <w:rPr>
             <w:rStyle w:val="aff1"/>
@@ -402,7 +402,7 @@
             <w:noProof/>
             <w:webHidden/>
           </w:rPr>
-          <w:instrText xml:space="preserve"> PAGEREF _Toc236979466 \h </w:instrText>
+          <w:instrText xml:space="preserve"> PAGEREF _Toc236986412 \h </w:instrText>
         </w:r>
         <w:r>
           <w:rPr>
@@ -449,7 +449,7 @@
           <w14:ligatures w14:val="standardContextual"/>
         </w:rPr>
       </w:pPr>
-      <w:hyperlink w:anchor="_Toc236979467" w:history="1">
+      <w:hyperlink w:anchor="_Toc236986413" w:history="1">
         <w:r>
           <w:rPr>
             <w:rStyle w:val="aff1"/>
@@ -476,7 +476,7 @@
             <w:noProof/>
             <w:webHidden/>
           </w:rPr>
-          <w:instrText xml:space="preserve"> PAGEREF _Toc236979467 \h </w:instrText>
+          <w:instrText xml:space="preserve"> PAGEREF _Toc236986413 \h </w:instrText>
         </w:r>
         <w:r>
           <w:rPr>
@@ -524,7 +524,7 @@
           <w14:ligatures w14:val="standardContextual"/>
         </w:rPr>
       </w:pPr>
-      <w:hyperlink w:anchor="_Toc236979468" w:history="1">
+      <w:hyperlink w:anchor="_Toc236986414" w:history="1">
         <w:r>
           <w:rPr>
             <w:rStyle w:val="aff1"/>
@@ -551,7 +551,7 @@
             <w:noProof/>
             <w:webHidden/>
           </w:rPr>
-          <w:instrText xml:space="preserve"> PAGEREF _Toc236979468 \h </w:instrText>
+          <w:instrText xml:space="preserve"> PAGEREF _Toc236986414 \h </w:instrText>
         </w:r>
         <w:r>
           <w:rPr>
@@ -599,7 +599,7 @@
           <w14:ligatures w14:val="standardContextual"/>
         </w:rPr>
       </w:pPr>
-      <w:hyperlink w:anchor="_Toc236979469" w:history="1">
+      <w:hyperlink w:anchor="_Toc236986415" w:history="1">
         <w:r>
           <w:rPr>
             <w:rStyle w:val="aff1"/>
@@ -627,7 +627,7 @@
             <w:noProof/>
             <w:webHidden/>
           </w:rPr>
-          <w:instrText xml:space="preserve"> PAGEREF _Toc236979469 \h </w:instrText>
+          <w:instrText xml:space="preserve"> PAGEREF _Toc236986415 \h </w:instrText>
         </w:r>
         <w:r>
           <w:rPr>
@@ -674,7 +674,7 @@
           <w14:ligatures w14:val="standardContextual"/>
         </w:rPr>
       </w:pPr>
-      <w:hyperlink w:anchor="_Toc236979470" w:history="1">
+      <w:hyperlink w:anchor="_Toc236986416" w:history="1">
         <w:r>
           <w:rPr>
             <w:rStyle w:val="aff1"/>
@@ -701,7 +701,7 @@
             <w:noProof/>
             <w:webHidden/>
           </w:rPr>
-          <w:instrText xml:space="preserve"> PAGEREF _Toc236979470 \h </w:instrText>
+          <w:instrText xml:space="preserve"> PAGEREF _Toc236986416 \h </w:instrText>
         </w:r>
         <w:r>
           <w:rPr>
@@ -749,7 +749,7 @@
           <w14:ligatures w14:val="standardContextual"/>
         </w:rPr>
       </w:pPr>
-      <w:hyperlink w:anchor="_Toc236979471" w:history="1">
+      <w:hyperlink w:anchor="_Toc236986417" w:history="1">
         <w:r>
           <w:rPr>
             <w:rStyle w:val="aff1"/>
@@ -776,7 +776,7 @@
             <w:noProof/>
             <w:webHidden/>
           </w:rPr>
-          <w:instrText xml:space="preserve"> PAGEREF _Toc236979471 \h </w:instrText>
+          <w:instrText xml:space="preserve"> PAGEREF _Toc236986417 \h </w:instrText>
         </w:r>
         <w:r>
           <w:rPr>
@@ -824,7 +824,7 @@
           <w14:ligatures w14:val="standardContextual"/>
         </w:rPr>
       </w:pPr>
-      <w:hyperlink w:anchor="_Toc236979472" w:history="1">
+      <w:hyperlink w:anchor="_Toc236986418" w:history="1">
         <w:r>
           <w:rPr>
             <w:rStyle w:val="aff1"/>
@@ -851,7 +851,7 @@
             <w:noProof/>
             <w:webHidden/>
           </w:rPr>
-          <w:instrText xml:space="preserve"> PAGEREF _Toc236979472 \h </w:instrText>
+          <w:instrText xml:space="preserve"> PAGEREF _Toc236986418 \h </w:instrText>
         </w:r>
         <w:r>
           <w:rPr>
@@ -899,7 +899,7 @@
           <w14:ligatures w14:val="standardContextual"/>
         </w:rPr>
       </w:pPr>
-      <w:hyperlink w:anchor="_Toc236979473" w:history="1">
+      <w:hyperlink w:anchor="_Toc236986419" w:history="1">
         <w:r>
           <w:rPr>
             <w:rStyle w:val="aff1"/>
@@ -926,7 +926,7 @@
             <w:noProof/>
             <w:webHidden/>
           </w:rPr>
-          <w:instrText xml:space="preserve"> PAGEREF _Toc236979473 \h </w:instrText>
+          <w:instrText xml:space="preserve"> PAGEREF _Toc236986419 \h </w:instrText>
         </w:r>
         <w:r>
           <w:rPr>
@@ -974,7 +974,7 @@
           <w14:ligatures w14:val="standardContextual"/>
         </w:rPr>
       </w:pPr>
-      <w:hyperlink w:anchor="_Toc236979474" w:history="1">
+      <w:hyperlink w:anchor="_Toc236986420" w:history="1">
         <w:r>
           <w:rPr>
             <w:rStyle w:val="aff1"/>
@@ -1002,7 +1002,7 @@
             <w:noProof/>
             <w:webHidden/>
           </w:rPr>
-          <w:instrText xml:space="preserve"> PAGEREF _Toc236979474 \h </w:instrText>
+          <w:instrText xml:space="preserve"> PAGEREF _Toc236986420 \h </w:instrText>
         </w:r>
         <w:r>
           <w:rPr>
@@ -1050,7 +1050,7 @@
           <w14:ligatures w14:val="standardContextual"/>
         </w:rPr>
       </w:pPr>
-      <w:hyperlink w:anchor="_Toc236979475" w:history="1">
+      <w:hyperlink w:anchor="_Toc236986421" w:history="1">
         <w:r>
           <w:rPr>
             <w:rStyle w:val="aff1"/>
@@ -1078,7 +1078,7 @@
             <w:noProof/>
             <w:webHidden/>
           </w:rPr>
-          <w:instrText xml:space="preserve"> PAGEREF _Toc236979475 \h </w:instrText>
+          <w:instrText xml:space="preserve"> PAGEREF _Toc236986421 \h </w:instrText>
         </w:r>
         <w:r>
           <w:rPr>
@@ -1126,7 +1126,7 @@
           <w14:ligatures w14:val="standardContextual"/>
         </w:rPr>
       </w:pPr>
-      <w:hyperlink w:anchor="_Toc236979476" w:history="1">
+      <w:hyperlink w:anchor="_Toc236986422" w:history="1">
         <w:r>
           <w:rPr>
             <w:rStyle w:val="aff1"/>
@@ -1154,7 +1154,7 @@
             <w:noProof/>
             <w:webHidden/>
           </w:rPr>
-          <w:instrText xml:space="preserve"> PAGEREF _Toc236979476 \h </w:instrText>
+          <w:instrText xml:space="preserve"> PAGEREF _Toc236986422 \h </w:instrText>
         </w:r>
         <w:r>
           <w:rPr>
@@ -1202,7 +1202,7 @@
           <w14:ligatures w14:val="standardContextual"/>
         </w:rPr>
       </w:pPr>
-      <w:hyperlink w:anchor="_Toc236979477" w:history="1">
+      <w:hyperlink w:anchor="_Toc236986423" w:history="1">
         <w:r>
           <w:rPr>
             <w:rStyle w:val="aff1"/>
@@ -1229,7 +1229,7 @@
             <w:noProof/>
             <w:webHidden/>
           </w:rPr>
-          <w:instrText xml:space="preserve"> PAGEREF _Toc236979477 \h </w:instrText>
+          <w:instrText xml:space="preserve"> PAGEREF _Toc236986423 \h </w:instrText>
         </w:r>
         <w:r>
           <w:rPr>
@@ -1276,7 +1276,7 @@
           <w14:ligatures w14:val="standardContextual"/>
         </w:rPr>
       </w:pPr>
-      <w:hyperlink w:anchor="_Toc236979478" w:history="1">
+      <w:hyperlink w:anchor="_Toc236986424" w:history="1">
         <w:r>
           <w:rPr>
             <w:rStyle w:val="aff1"/>
@@ -1304,7 +1304,7 @@
             <w:noProof/>
             <w:webHidden/>
           </w:rPr>
-          <w:instrText xml:space="preserve"> PAGEREF _Toc236979478 \h </w:instrText>
+          <w:instrText xml:space="preserve"> PAGEREF _Toc236986424 \h </w:instrText>
         </w:r>
         <w:r>
           <w:rPr>
@@ -1352,7 +1352,7 @@
           <w14:ligatures w14:val="standardContextual"/>
         </w:rPr>
       </w:pPr>
-      <w:hyperlink w:anchor="_Toc236979479" w:history="1">
+      <w:hyperlink w:anchor="_Toc236986425" w:history="1">
         <w:r>
           <w:rPr>
             <w:rStyle w:val="aff1"/>
@@ -1380,7 +1380,7 @@
             <w:noProof/>
             <w:webHidden/>
           </w:rPr>
-          <w:instrText xml:space="preserve"> PAGEREF _Toc236979479 \h </w:instrText>
+          <w:instrText xml:space="preserve"> PAGEREF _Toc236986425 \h </w:instrText>
         </w:r>
         <w:r>
           <w:rPr>
@@ -1428,7 +1428,7 @@
           <w14:ligatures w14:val="standardContextual"/>
         </w:rPr>
       </w:pPr>
-      <w:hyperlink w:anchor="_Toc236979480" w:history="1">
+      <w:hyperlink w:anchor="_Toc236986426" w:history="1">
         <w:r>
           <w:rPr>
             <w:rStyle w:val="aff1"/>
@@ -1455,7 +1455,7 @@
             <w:noProof/>
             <w:webHidden/>
           </w:rPr>
-          <w:instrText xml:space="preserve"> PAGEREF _Toc236979480 \h </w:instrText>
+          <w:instrText xml:space="preserve"> PAGEREF _Toc236986426 \h </w:instrText>
         </w:r>
         <w:r>
           <w:rPr>
@@ -1503,7 +1503,7 @@
           <w14:ligatures w14:val="standardContextual"/>
         </w:rPr>
       </w:pPr>
-      <w:hyperlink w:anchor="_Toc236979481" w:history="1">
+      <w:hyperlink w:anchor="_Toc236986427" w:history="1">
         <w:r>
           <w:rPr>
             <w:rStyle w:val="aff1"/>
@@ -1530,7 +1530,7 @@
             <w:noProof/>
             <w:webHidden/>
           </w:rPr>
-          <w:instrText xml:space="preserve"> PAGEREF _Toc236979481 \h </w:instrText>
+          <w:instrText xml:space="preserve"> PAGEREF _Toc236986427 \h </w:instrText>
         </w:r>
         <w:r>
           <w:rPr>
@@ -1578,7 +1578,7 @@
           <w14:ligatures w14:val="standardContextual"/>
         </w:rPr>
       </w:pPr>
-      <w:hyperlink w:anchor="_Toc236979482" w:history="1">
+      <w:hyperlink w:anchor="_Toc236986428" w:history="1">
         <w:r>
           <w:rPr>
             <w:rStyle w:val="aff1"/>
@@ -1605,7 +1605,7 @@
             <w:noProof/>
             <w:webHidden/>
           </w:rPr>
-          <w:instrText xml:space="preserve"> PAGEREF _Toc236979482 \h </w:instrText>
+          <w:instrText xml:space="preserve"> PAGEREF _Toc236986428 \h </w:instrText>
         </w:r>
         <w:r>
           <w:rPr>
@@ -1653,7 +1653,7 @@
           <w14:ligatures w14:val="standardContextual"/>
         </w:rPr>
       </w:pPr>
-      <w:hyperlink w:anchor="_Toc236979483" w:history="1">
+      <w:hyperlink w:anchor="_Toc236986429" w:history="1">
         <w:r>
           <w:rPr>
             <w:rStyle w:val="aff1"/>
@@ -1680,7 +1680,7 @@
             <w:noProof/>
             <w:webHidden/>
           </w:rPr>
-          <w:instrText xml:space="preserve"> PAGEREF _Toc236979483 \h </w:instrText>
+          <w:instrText xml:space="preserve"> PAGEREF _Toc236986429 \h </w:instrText>
         </w:r>
         <w:r>
           <w:rPr>
@@ -1728,7 +1728,7 @@
           <w14:ligatures w14:val="standardContextual"/>
         </w:rPr>
       </w:pPr>
-      <w:hyperlink w:anchor="_Toc236979484" w:history="1">
+      <w:hyperlink w:anchor="_Toc236986430" w:history="1">
         <w:r>
           <w:rPr>
             <w:rStyle w:val="aff1"/>
@@ -1755,7 +1755,7 @@
             <w:noProof/>
             <w:webHidden/>
           </w:rPr>
-          <w:instrText xml:space="preserve"> PAGEREF _Toc236979484 \h </w:instrText>
+          <w:instrText xml:space="preserve"> PAGEREF _Toc236986430 \h </w:instrText>
         </w:r>
         <w:r>
           <w:rPr>
@@ -1803,7 +1803,7 @@
           <w14:ligatures w14:val="standardContextual"/>
         </w:rPr>
       </w:pPr>
-      <w:hyperlink w:anchor="_Toc236979485" w:history="1">
+      <w:hyperlink w:anchor="_Toc236986431" w:history="1">
         <w:r>
           <w:rPr>
             <w:rStyle w:val="aff1"/>
@@ -1830,7 +1830,7 @@
             <w:noProof/>
             <w:webHidden/>
           </w:rPr>
-          <w:instrText xml:space="preserve"> PAGEREF _Toc236979485 \h </w:instrText>
+          <w:instrText xml:space="preserve"> PAGEREF _Toc236986431 \h </w:instrText>
         </w:r>
         <w:r>
           <w:rPr>
@@ -1878,7 +1878,7 @@
           <w14:ligatures w14:val="standardContextual"/>
         </w:rPr>
       </w:pPr>
-      <w:hyperlink w:anchor="_Toc236979486" w:history="1">
+      <w:hyperlink w:anchor="_Toc236986432" w:history="1">
         <w:r>
           <w:rPr>
             <w:rStyle w:val="aff1"/>
@@ -1905,7 +1905,7 @@
             <w:noProof/>
             <w:webHidden/>
           </w:rPr>
-          <w:instrText xml:space="preserve"> PAGEREF _Toc236979486 \h </w:instrText>
+          <w:instrText xml:space="preserve"> PAGEREF _Toc236986432 \h </w:instrText>
         </w:r>
         <w:r>
           <w:rPr>
@@ -1953,7 +1953,7 @@
           <w14:ligatures w14:val="standardContextual"/>
         </w:rPr>
       </w:pPr>
-      <w:hyperlink w:anchor="_Toc236979487" w:history="1">
+      <w:hyperlink w:anchor="_Toc236986433" w:history="1">
         <w:r>
           <w:rPr>
             <w:rStyle w:val="aff1"/>
@@ -1980,7 +1980,7 @@
             <w:noProof/>
             <w:webHidden/>
           </w:rPr>
-          <w:instrText xml:space="preserve"> PAGEREF _Toc236979487 \h </w:instrText>
+          <w:instrText xml:space="preserve"> PAGEREF _Toc236986433 \h </w:instrText>
         </w:r>
         <w:r>
           <w:rPr>
@@ -2028,7 +2028,7 @@
           <w14:ligatures w14:val="standardContextual"/>
         </w:rPr>
       </w:pPr>
-      <w:hyperlink w:anchor="_Toc236979488" w:history="1">
+      <w:hyperlink w:anchor="_Toc236986434" w:history="1">
         <w:r>
           <w:rPr>
             <w:rStyle w:val="aff1"/>
@@ -2056,7 +2056,7 @@
             <w:noProof/>
             <w:webHidden/>
           </w:rPr>
-          <w:instrText xml:space="preserve"> PAGEREF _Toc236979488 \h </w:instrText>
+          <w:instrText xml:space="preserve"> PAGEREF _Toc236986434 \h </w:instrText>
         </w:r>
         <w:r>
           <w:rPr>
@@ -2104,7 +2104,7 @@
           <w14:ligatures w14:val="standardContextual"/>
         </w:rPr>
       </w:pPr>
-      <w:hyperlink w:anchor="_Toc236979489" w:history="1">
+      <w:hyperlink w:anchor="_Toc236986435" w:history="1">
         <w:r>
           <w:rPr>
             <w:rStyle w:val="aff1"/>
@@ -2131,7 +2131,7 @@
             <w:noProof/>
             <w:webHidden/>
           </w:rPr>
-          <w:instrText xml:space="preserve"> PAGEREF _Toc236979489 \h </w:instrText>
+          <w:instrText xml:space="preserve"> PAGEREF _Toc236986435 \h </w:instrText>
         </w:r>
         <w:r>
           <w:rPr>
@@ -2179,7 +2179,7 @@
           <w14:ligatures w14:val="standardContextual"/>
         </w:rPr>
       </w:pPr>
-      <w:hyperlink w:anchor="_Toc236979490" w:history="1">
+      <w:hyperlink w:anchor="_Toc236986436" w:history="1">
         <w:r>
           <w:rPr>
             <w:rStyle w:val="aff1"/>
@@ -2206,7 +2206,7 @@
             <w:noProof/>
             <w:webHidden/>
           </w:rPr>
-          <w:instrText xml:space="preserve"> PAGEREF _Toc236979490 \h </w:instrText>
+          <w:instrText xml:space="preserve"> PAGEREF _Toc236986436 \h </w:instrText>
         </w:r>
         <w:r>
           <w:rPr>
@@ -2254,7 +2254,7 @@
           <w14:ligatures w14:val="standardContextual"/>
         </w:rPr>
       </w:pPr>
-      <w:hyperlink w:anchor="_Toc236979491" w:history="1">
+      <w:hyperlink w:anchor="_Toc236986437" w:history="1">
         <w:r>
           <w:rPr>
             <w:rStyle w:val="aff1"/>
@@ -2282,7 +2282,7 @@
             <w:noProof/>
             <w:webHidden/>
           </w:rPr>
-          <w:instrText xml:space="preserve"> PAGEREF _Toc236979491 \h </w:instrText>
+          <w:instrText xml:space="preserve"> PAGEREF _Toc236986437 \h </w:instrText>
         </w:r>
         <w:r>
           <w:rPr>
@@ -2330,7 +2330,7 @@
           <w14:ligatures w14:val="standardContextual"/>
         </w:rPr>
       </w:pPr>
-      <w:hyperlink w:anchor="_Toc236979492" w:history="1">
+      <w:hyperlink w:anchor="_Toc236986438" w:history="1">
         <w:r>
           <w:rPr>
             <w:rStyle w:val="aff1"/>
@@ -2357,7 +2357,7 @@
             <w:noProof/>
             <w:webHidden/>
           </w:rPr>
-          <w:instrText xml:space="preserve"> PAGEREF _Toc236979492 \h </w:instrText>
+          <w:instrText xml:space="preserve"> PAGEREF _Toc236986438 \h </w:instrText>
         </w:r>
         <w:r>
           <w:rPr>
@@ -2404,7 +2404,7 @@
           <w14:ligatures w14:val="standardContextual"/>
         </w:rPr>
       </w:pPr>
-      <w:hyperlink w:anchor="_Toc236979493" w:history="1">
+      <w:hyperlink w:anchor="_Toc236986439" w:history="1">
         <w:r>
           <w:rPr>
             <w:rStyle w:val="aff1"/>
@@ -2431,7 +2431,7 @@
             <w:noProof/>
             <w:webHidden/>
           </w:rPr>
-          <w:instrText xml:space="preserve"> PAGEREF _Toc236979493 \h </w:instrText>
+          <w:instrText xml:space="preserve"> PAGEREF _Toc236986439 \h </w:instrText>
         </w:r>
         <w:r>
           <w:rPr>
@@ -2478,7 +2478,7 @@
           <w14:ligatures w14:val="standardContextual"/>
         </w:rPr>
       </w:pPr>
-      <w:hyperlink w:anchor="_Toc236979494" w:history="1">
+      <w:hyperlink w:anchor="_Toc236986440" w:history="1">
         <w:r>
           <w:rPr>
             <w:rStyle w:val="aff1"/>
@@ -2506,7 +2506,7 @@
             <w:noProof/>
             <w:webHidden/>
           </w:rPr>
-          <w:instrText xml:space="preserve"> PAGEREF _Toc236979494 \h </w:instrText>
+          <w:instrText xml:space="preserve"> PAGEREF _Toc236986440 \h </w:instrText>
         </w:r>
         <w:r>
           <w:rPr>
@@ -2553,14 +2553,14 @@
           <w14:ligatures w14:val="standardContextual"/>
         </w:rPr>
       </w:pPr>
-      <w:hyperlink w:anchor="_Toc236979495" w:history="1">
+      <w:hyperlink w:anchor="_Toc236986441" w:history="1">
         <w:r>
           <w:rPr>
             <w:rStyle w:val="aff1"/>
             <w:noProof/>
             <w:lang w:eastAsia="ko-KR"/>
           </w:rPr>
-          <w:t>7. Agent Manager(자동 발견·승인)</w:t>
+          <w:t>7. Agent Manager(자동 발견)</w:t>
         </w:r>
         <w:r>
           <w:rPr>
@@ -2581,7 +2581,7 @@
             <w:noProof/>
             <w:webHidden/>
           </w:rPr>
-          <w:instrText xml:space="preserve"> PAGEREF _Toc236979495 \h </w:instrText>
+          <w:instrText xml:space="preserve"> PAGEREF _Toc236986441 \h </w:instrText>
         </w:r>
         <w:r>
           <w:rPr>
@@ -2629,7 +2629,7 @@
           <w14:ligatures w14:val="standardContextual"/>
         </w:rPr>
       </w:pPr>
-      <w:hyperlink w:anchor="_Toc236979496" w:history="1">
+      <w:hyperlink w:anchor="_Toc236986442" w:history="1">
         <w:r>
           <w:rPr>
             <w:rStyle w:val="aff1"/>
@@ -2656,7 +2656,7 @@
             <w:noProof/>
             <w:webHidden/>
           </w:rPr>
-          <w:instrText xml:space="preserve"> PAGEREF _Toc236979496 \h </w:instrText>
+          <w:instrText xml:space="preserve"> PAGEREF _Toc236986442 \h </w:instrText>
         </w:r>
         <w:r>
           <w:rPr>
@@ -2704,7 +2704,7 @@
           <w14:ligatures w14:val="standardContextual"/>
         </w:rPr>
       </w:pPr>
-      <w:hyperlink w:anchor="_Toc236979497" w:history="1">
+      <w:hyperlink w:anchor="_Toc236986443" w:history="1">
         <w:r>
           <w:rPr>
             <w:rStyle w:val="aff1"/>
@@ -2731,7 +2731,7 @@
             <w:noProof/>
             <w:webHidden/>
           </w:rPr>
-          <w:instrText xml:space="preserve"> PAGEREF _Toc236979497 \h </w:instrText>
+          <w:instrText xml:space="preserve"> PAGEREF _Toc236986443 \h </w:instrText>
         </w:r>
         <w:r>
           <w:rPr>
@@ -2778,7 +2778,7 @@
           <w14:ligatures w14:val="standardContextual"/>
         </w:rPr>
       </w:pPr>
-      <w:hyperlink w:anchor="_Toc236979498" w:history="1">
+      <w:hyperlink w:anchor="_Toc236986444" w:history="1">
         <w:r>
           <w:rPr>
             <w:rStyle w:val="aff1"/>
@@ -2813,7 +2813,7 @@
             <w:noProof/>
             <w:webHidden/>
           </w:rPr>
-          <w:instrText xml:space="preserve"> PAGEREF _Toc236979498 \h </w:instrText>
+          <w:instrText xml:space="preserve"> PAGEREF _Toc236986444 \h </w:instrText>
         </w:r>
         <w:r>
           <w:rPr>
@@ -2861,7 +2861,7 @@
           <w14:ligatures w14:val="standardContextual"/>
         </w:rPr>
       </w:pPr>
-      <w:hyperlink w:anchor="_Toc236979499" w:history="1">
+      <w:hyperlink w:anchor="_Toc236986445" w:history="1">
         <w:r>
           <w:rPr>
             <w:rStyle w:val="aff1"/>
@@ -2888,7 +2888,7 @@
             <w:noProof/>
             <w:webHidden/>
           </w:rPr>
-          <w:instrText xml:space="preserve"> PAGEREF _Toc236979499 \h </w:instrText>
+          <w:instrText xml:space="preserve"> PAGEREF _Toc236986445 \h </w:instrText>
         </w:r>
         <w:r>
           <w:rPr>
@@ -2936,7 +2936,7 @@
           <w14:ligatures w14:val="standardContextual"/>
         </w:rPr>
       </w:pPr>
-      <w:hyperlink w:anchor="_Toc236979500" w:history="1">
+      <w:hyperlink w:anchor="_Toc236986446" w:history="1">
         <w:r>
           <w:rPr>
             <w:rStyle w:val="aff1"/>
@@ -2963,7 +2963,7 @@
             <w:noProof/>
             <w:webHidden/>
           </w:rPr>
-          <w:instrText xml:space="preserve"> PAGEREF _Toc236979500 \h </w:instrText>
+          <w:instrText xml:space="preserve"> PAGEREF _Toc236986446 \h </w:instrText>
         </w:r>
         <w:r>
           <w:rPr>
@@ -3011,7 +3011,7 @@
           <w14:ligatures w14:val="standardContextual"/>
         </w:rPr>
       </w:pPr>
-      <w:hyperlink w:anchor="_Toc236979501" w:history="1">
+      <w:hyperlink w:anchor="_Toc236986447" w:history="1">
         <w:r>
           <w:rPr>
             <w:rStyle w:val="aff1"/>
@@ -3038,7 +3038,7 @@
             <w:noProof/>
             <w:webHidden/>
           </w:rPr>
-          <w:instrText xml:space="preserve"> PAGEREF _Toc236979501 \h </w:instrText>
+          <w:instrText xml:space="preserve"> PAGEREF _Toc236986447 \h </w:instrText>
         </w:r>
         <w:r>
           <w:rPr>
@@ -3085,7 +3085,7 @@
           <w14:ligatures w14:val="standardContextual"/>
         </w:rPr>
       </w:pPr>
-      <w:hyperlink w:anchor="_Toc236979502" w:history="1">
+      <w:hyperlink w:anchor="_Toc236986448" w:history="1">
         <w:r>
           <w:rPr>
             <w:rStyle w:val="aff1"/>
@@ -3113,7 +3113,7 @@
             <w:noProof/>
             <w:webHidden/>
           </w:rPr>
-          <w:instrText xml:space="preserve"> PAGEREF _Toc236979502 \h </w:instrText>
+          <w:instrText xml:space="preserve"> PAGEREF _Toc236986448 \h </w:instrText>
         </w:r>
         <w:r>
           <w:rPr>
@@ -3160,7 +3160,7 @@
           <w14:ligatures w14:val="standardContextual"/>
         </w:rPr>
       </w:pPr>
-      <w:hyperlink w:anchor="_Toc236979503" w:history="1">
+      <w:hyperlink w:anchor="_Toc236986449" w:history="1">
         <w:r>
           <w:rPr>
             <w:rStyle w:val="aff1"/>
@@ -3202,7 +3202,7 @@
             <w:noProof/>
             <w:webHidden/>
           </w:rPr>
-          <w:instrText xml:space="preserve"> PAGEREF _Toc236979503 \h </w:instrText>
+          <w:instrText xml:space="preserve"> PAGEREF _Toc236986449 \h </w:instrText>
         </w:r>
         <w:r>
           <w:rPr>
@@ -3250,7 +3250,7 @@
           <w14:ligatures w14:val="standardContextual"/>
         </w:rPr>
       </w:pPr>
-      <w:hyperlink w:anchor="_Toc236979504" w:history="1">
+      <w:hyperlink w:anchor="_Toc236986450" w:history="1">
         <w:r>
           <w:rPr>
             <w:rStyle w:val="aff1"/>
@@ -3277,7 +3277,7 @@
             <w:noProof/>
             <w:webHidden/>
           </w:rPr>
-          <w:instrText xml:space="preserve"> PAGEREF _Toc236979504 \h </w:instrText>
+          <w:instrText xml:space="preserve"> PAGEREF _Toc236986450 \h </w:instrText>
         </w:r>
         <w:r>
           <w:rPr>
@@ -3325,7 +3325,7 @@
           <w14:ligatures w14:val="standardContextual"/>
         </w:rPr>
       </w:pPr>
-      <w:hyperlink w:anchor="_Toc236979505" w:history="1">
+      <w:hyperlink w:anchor="_Toc236986451" w:history="1">
         <w:r>
           <w:rPr>
             <w:rStyle w:val="aff1"/>
@@ -3352,7 +3352,7 @@
             <w:noProof/>
             <w:webHidden/>
           </w:rPr>
-          <w:instrText xml:space="preserve"> PAGEREF _Toc236979505 \h </w:instrText>
+          <w:instrText xml:space="preserve"> PAGEREF _Toc236986451 \h </w:instrText>
         </w:r>
         <w:r>
           <w:rPr>
@@ -3400,7 +3400,7 @@
           <w14:ligatures w14:val="standardContextual"/>
         </w:rPr>
       </w:pPr>
-      <w:hyperlink w:anchor="_Toc236979506" w:history="1">
+      <w:hyperlink w:anchor="_Toc236986452" w:history="1">
         <w:r>
           <w:rPr>
             <w:rStyle w:val="aff1"/>
@@ -3427,7 +3427,7 @@
             <w:noProof/>
             <w:webHidden/>
           </w:rPr>
-          <w:instrText xml:space="preserve"> PAGEREF _Toc236979506 \h </w:instrText>
+          <w:instrText xml:space="preserve"> PAGEREF _Toc236986452 \h </w:instrText>
         </w:r>
         <w:r>
           <w:rPr>
@@ -3488,7 +3488,7 @@
           <w:lang w:eastAsia="ko-KR"/>
         </w:rPr>
       </w:pPr>
-      <w:bookmarkStart w:id="0" w:name="_Toc236979466"/>
+      <w:bookmarkStart w:id="0" w:name="_Toc236986412"/>
       <w:r>
         <w:rPr>
           <w:lang w:eastAsia="ko-KR"/>
@@ -3731,7 +3731,7 @@
       <w:pPr>
         <w:pStyle w:val="1"/>
       </w:pPr>
-      <w:bookmarkStart w:id="1" w:name="_Toc236979467"/>
+      <w:bookmarkStart w:id="1" w:name="_Toc236986413"/>
       <w:r>
         <w:t xml:space="preserve">2. </w:t>
       </w:r>
@@ -3754,7 +3754,7 @@
       <w:pPr>
         <w:pStyle w:val="21"/>
       </w:pPr>
-      <w:bookmarkStart w:id="2" w:name="_Toc236979468"/>
+      <w:bookmarkStart w:id="2" w:name="_Toc236986414"/>
       <w:r>
         <w:t xml:space="preserve">2.1 </w:t>
       </w:r>
@@ -4632,7 +4632,7 @@
           <w:lang w:eastAsia="ko-KR"/>
         </w:rPr>
       </w:pPr>
-      <w:bookmarkStart w:id="3" w:name="_Toc236979469"/>
+      <w:bookmarkStart w:id="3" w:name="_Toc236986415"/>
       <w:r>
         <w:rPr>
           <w:lang w:eastAsia="ko-KR"/>
@@ -6849,7 +6849,7 @@
       <w:pPr>
         <w:pStyle w:val="1"/>
       </w:pPr>
-      <w:bookmarkStart w:id="4" w:name="_Toc236979470"/>
+      <w:bookmarkStart w:id="4" w:name="_Toc236986416"/>
       <w:r>
         <w:t xml:space="preserve">3. </w:t>
       </w:r>
@@ -6864,7 +6864,7 @@
       <w:pPr>
         <w:pStyle w:val="21"/>
       </w:pPr>
-      <w:bookmarkStart w:id="5" w:name="_Toc236979471"/>
+      <w:bookmarkStart w:id="5" w:name="_Toc236986417"/>
       <w:r>
         <w:t xml:space="preserve">3.1 </w:t>
       </w:r>
@@ -7293,7 +7293,7 @@
       <w:pPr>
         <w:pStyle w:val="21"/>
       </w:pPr>
-      <w:bookmarkStart w:id="6" w:name="_Toc236979472"/>
+      <w:bookmarkStart w:id="6" w:name="_Toc236986418"/>
       <w:r>
         <w:t xml:space="preserve">3.2 </w:t>
       </w:r>
@@ -7616,7 +7616,7 @@
       <w:pPr>
         <w:pStyle w:val="21"/>
       </w:pPr>
-      <w:bookmarkStart w:id="7" w:name="_Toc236979473"/>
+      <w:bookmarkStart w:id="7" w:name="_Toc236986419"/>
       <w:r>
         <w:t xml:space="preserve">3.3 NATS </w:t>
       </w:r>
@@ -7816,7 +7816,7 @@
           <w:lang w:eastAsia="ko-KR"/>
         </w:rPr>
       </w:pPr>
-      <w:bookmarkStart w:id="8" w:name="_Toc236979474"/>
+      <w:bookmarkStart w:id="8" w:name="_Toc236986420"/>
       <w:r>
         <w:rPr>
           <w:lang w:eastAsia="ko-KR"/>
@@ -7948,7 +7948,7 @@
           <w:lang w:eastAsia="ko-KR"/>
         </w:rPr>
       </w:pPr>
-      <w:bookmarkStart w:id="9" w:name="_Toc236979475"/>
+      <w:bookmarkStart w:id="9" w:name="_Toc236986421"/>
       <w:r>
         <w:rPr>
           <w:lang w:eastAsia="ko-KR"/>
@@ -8221,7 +8221,7 @@
           <w:lang w:eastAsia="ko-KR"/>
         </w:rPr>
       </w:pPr>
-      <w:bookmarkStart w:id="10" w:name="_Toc236979476"/>
+      <w:bookmarkStart w:id="10" w:name="_Toc236986422"/>
       <w:r>
         <w:rPr>
           <w:lang w:eastAsia="ko-KR"/>
@@ -8462,7 +8462,7 @@
       <w:pPr>
         <w:pStyle w:val="21"/>
       </w:pPr>
-      <w:bookmarkStart w:id="11" w:name="_Toc236979477"/>
+      <w:bookmarkStart w:id="11" w:name="_Toc236986423"/>
       <w:r>
         <w:t xml:space="preserve">3.7 </w:t>
       </w:r>
@@ -9035,7 +9035,7 @@
           <w:lang w:eastAsia="ko-KR"/>
         </w:rPr>
       </w:pPr>
-      <w:bookmarkStart w:id="12" w:name="_Toc236979478"/>
+      <w:bookmarkStart w:id="12" w:name="_Toc236986424"/>
       <w:r>
         <w:rPr>
           <w:lang w:eastAsia="ko-KR"/>
@@ -9081,7 +9081,7 @@
           <w:lang w:eastAsia="ko-KR"/>
         </w:rPr>
       </w:pPr>
-      <w:bookmarkStart w:id="13" w:name="_Toc236979479"/>
+      <w:bookmarkStart w:id="13" w:name="_Toc236986425"/>
       <w:r>
         <w:rPr>
           <w:lang w:eastAsia="ko-KR"/>
@@ -9806,7 +9806,7 @@
       <w:pPr>
         <w:pStyle w:val="21"/>
       </w:pPr>
-      <w:bookmarkStart w:id="14" w:name="_Toc236979480"/>
+      <w:bookmarkStart w:id="14" w:name="_Toc236986426"/>
       <w:r>
         <w:t xml:space="preserve">4.2 </w:t>
       </w:r>
@@ -10310,7 +10310,7 @@
       <w:pPr>
         <w:pStyle w:val="31"/>
       </w:pPr>
-      <w:bookmarkStart w:id="15" w:name="_Toc236979481"/>
+      <w:bookmarkStart w:id="15" w:name="_Toc236986427"/>
       <w:r>
         <w:t>Nats</w:t>
       </w:r>
@@ -10436,7 +10436,7 @@
       <w:pPr>
         <w:pStyle w:val="31"/>
       </w:pPr>
-      <w:bookmarkStart w:id="16" w:name="_Toc236979482"/>
+      <w:bookmarkStart w:id="16" w:name="_Toc236986428"/>
       <w:r>
         <w:t>Serial</w:t>
       </w:r>
@@ -10714,7 +10714,7 @@
       <w:pPr>
         <w:pStyle w:val="31"/>
       </w:pPr>
-      <w:bookmarkStart w:id="17" w:name="_Toc236979483"/>
+      <w:bookmarkStart w:id="17" w:name="_Toc236986429"/>
       <w:proofErr w:type="gramStart"/>
       <w:r>
         <w:t>CameraPairings[</w:t>
@@ -11009,7 +11009,7 @@
       <w:pPr>
         <w:pStyle w:val="21"/>
       </w:pPr>
-      <w:bookmarkStart w:id="18" w:name="_Toc236979484"/>
+      <w:bookmarkStart w:id="18" w:name="_Toc236986430"/>
       <w:r>
         <w:t xml:space="preserve">4.3 </w:t>
       </w:r>
@@ -13081,7 +13081,7 @@
       <w:pPr>
         <w:pStyle w:val="21"/>
       </w:pPr>
-      <w:bookmarkStart w:id="19" w:name="_Toc236979485"/>
+      <w:bookmarkStart w:id="19" w:name="_Toc236986431"/>
       <w:r>
         <w:t xml:space="preserve">4.4 </w:t>
       </w:r>
@@ -13653,7 +13653,7 @@
       <w:pPr>
         <w:pStyle w:val="31"/>
       </w:pPr>
-      <w:bookmarkStart w:id="20" w:name="_Toc236979486"/>
+      <w:bookmarkStart w:id="20" w:name="_Toc236986432"/>
       <w:proofErr w:type="spellStart"/>
       <w:r>
         <w:t>BlackBody.Units</w:t>
@@ -14231,7 +14231,7 @@
       <w:pPr>
         <w:pStyle w:val="21"/>
       </w:pPr>
-      <w:bookmarkStart w:id="21" w:name="_Toc236979487"/>
+      <w:bookmarkStart w:id="21" w:name="_Toc236986433"/>
       <w:r>
         <w:t xml:space="preserve">4.5 </w:t>
       </w:r>
@@ -14758,7 +14758,7 @@
           <w:lang w:eastAsia="ko-KR"/>
         </w:rPr>
       </w:pPr>
-      <w:bookmarkStart w:id="22" w:name="_Toc236979488"/>
+      <w:bookmarkStart w:id="22" w:name="_Toc236986434"/>
       <w:r>
         <w:rPr>
           <w:lang w:eastAsia="ko-KR"/>
@@ -15089,7 +15089,7 @@
       <w:pPr>
         <w:pStyle w:val="21"/>
       </w:pPr>
-      <w:bookmarkStart w:id="23" w:name="_Toc236979489"/>
+      <w:bookmarkStart w:id="23" w:name="_Toc236986435"/>
       <w:r>
         <w:t xml:space="preserve">4.7 AgentManager </w:t>
       </w:r>
@@ -15114,7 +15114,7 @@
       <w:pPr>
         <w:pStyle w:val="31"/>
       </w:pPr>
-      <w:bookmarkStart w:id="24" w:name="_Toc236979490"/>
+      <w:bookmarkStart w:id="24" w:name="_Toc236986436"/>
       <w:r>
         <w:t>manager-</w:t>
       </w:r>
@@ -15656,7 +15656,7 @@
           <w:lang w:eastAsia="ko-KR"/>
         </w:rPr>
       </w:pPr>
-      <w:bookmarkStart w:id="25" w:name="_Toc236979491"/>
+      <w:bookmarkStart w:id="25" w:name="_Toc236986437"/>
       <w:r>
         <w:rPr>
           <w:lang w:eastAsia="ko-KR"/>
@@ -15853,7 +15853,7 @@
       <w:pPr>
         <w:pStyle w:val="31"/>
       </w:pPr>
-      <w:bookmarkStart w:id="26" w:name="_Toc236979492"/>
+      <w:bookmarkStart w:id="26" w:name="_Toc236986438"/>
       <w:r>
         <w:t>manager-</w:t>
       </w:r>
@@ -16377,7 +16377,7 @@
       <w:pPr>
         <w:pStyle w:val="1"/>
       </w:pPr>
-      <w:bookmarkStart w:id="27" w:name="_Toc236979493"/>
+      <w:bookmarkStart w:id="27" w:name="_Toc236986439"/>
       <w:r>
         <w:t xml:space="preserve">5. PLC </w:t>
       </w:r>
@@ -17054,7 +17054,7 @@
           <w:lang w:eastAsia="ko-KR"/>
         </w:rPr>
       </w:pPr>
-      <w:bookmarkStart w:id="28" w:name="_Toc236979494"/>
+      <w:bookmarkStart w:id="28" w:name="_Toc236986440"/>
       <w:r>
         <w:rPr>
           <w:lang w:eastAsia="ko-KR"/>
@@ -17528,7 +17528,7 @@
           <w:lang w:eastAsia="ko-KR"/>
         </w:rPr>
       </w:pPr>
-      <w:bookmarkStart w:id="29" w:name="_Toc236979495"/>
+      <w:bookmarkStart w:id="29" w:name="_Toc236986441"/>
       <w:r>
         <w:rPr>
           <w:lang w:eastAsia="ko-KR"/>
@@ -17676,7 +17676,7 @@
       <w:pPr>
         <w:pStyle w:val="21"/>
       </w:pPr>
-      <w:bookmarkStart w:id="30" w:name="_Toc236979496"/>
+      <w:bookmarkStart w:id="30" w:name="_Toc236986442"/>
       <w:r>
         <w:t xml:space="preserve">7.1 </w:t>
       </w:r>
@@ -17746,7 +17746,7 @@
       <w:pPr>
         <w:pStyle w:val="21"/>
       </w:pPr>
-      <w:bookmarkStart w:id="31" w:name="_Toc236979497"/>
+      <w:bookmarkStart w:id="31" w:name="_Toc236986443"/>
       <w:r>
         <w:t xml:space="preserve">7.2 </w:t>
       </w:r>
@@ -17971,7 +17971,7 @@
       <w:pPr>
         <w:pStyle w:val="1"/>
       </w:pPr>
-      <w:bookmarkStart w:id="32" w:name="_Toc236979498"/>
+      <w:bookmarkStart w:id="32" w:name="_Toc236986444"/>
       <w:r>
         <w:rPr>
           <w:rFonts w:eastAsia="맑은 고딕" w:hint="eastAsia"/>
@@ -18124,7 +18124,7 @@
       <w:pPr>
         <w:pStyle w:val="21"/>
       </w:pPr>
-      <w:bookmarkStart w:id="33" w:name="_Toc236979499"/>
+      <w:bookmarkStart w:id="33" w:name="_Toc236986445"/>
       <w:r>
         <w:t>백업</w:t>
       </w:r>
@@ -18239,7 +18239,7 @@
       <w:pPr>
         <w:pStyle w:val="21"/>
       </w:pPr>
-      <w:bookmarkStart w:id="34" w:name="_Toc236979500"/>
+      <w:bookmarkStart w:id="34" w:name="_Toc236986446"/>
       <w:proofErr w:type="spellStart"/>
       <w:r>
         <w:t>복원</w:t>
@@ -18454,7 +18454,7 @@
       <w:pPr>
         <w:pStyle w:val="21"/>
       </w:pPr>
-      <w:bookmarkStart w:id="35" w:name="_Toc236979501"/>
+      <w:bookmarkStart w:id="35" w:name="_Toc236986447"/>
       <w:r>
         <w:t>초기화</w:t>
       </w:r>
@@ -18588,7 +18588,7 @@
           <w:lang w:eastAsia="ko-KR"/>
         </w:rPr>
       </w:pPr>
-      <w:bookmarkStart w:id="36" w:name="_Toc236979502"/>
+      <w:bookmarkStart w:id="36" w:name="_Toc236986448"/>
       <w:r>
         <w:rPr>
           <w:rFonts w:eastAsia="맑은 고딕" w:hint="eastAsia"/>
@@ -19683,7 +19683,7 @@
       <w:pPr>
         <w:pStyle w:val="1"/>
       </w:pPr>
-      <w:bookmarkStart w:id="37" w:name="_Toc236979503"/>
+      <w:bookmarkStart w:id="37" w:name="_Toc236986449"/>
       <w:r>
         <w:t>1</w:t>
       </w:r>
@@ -20681,7 +20681,7 @@
       <w:pPr>
         <w:pStyle w:val="21"/>
       </w:pPr>
-      <w:bookmarkStart w:id="38" w:name="_Toc236979504"/>
+      <w:bookmarkStart w:id="38" w:name="_Toc236986450"/>
       <w:r>
         <w:t>경로</w:t>
       </w:r>
@@ -20818,7 +20818,7 @@
       <w:pPr>
         <w:pStyle w:val="21"/>
       </w:pPr>
-      <w:bookmarkStart w:id="39" w:name="_Toc236979505"/>
+      <w:bookmarkStart w:id="39" w:name="_Toc236986451"/>
       <w:r>
         <w:t>생성</w:t>
       </w:r>
@@ -21017,7 +21017,7 @@
       <w:pPr>
         <w:pStyle w:val="21"/>
       </w:pPr>
-      <w:bookmarkStart w:id="40" w:name="_Toc236979506"/>
+      <w:bookmarkStart w:id="40" w:name="_Toc236986452"/>
       <w:r>
         <w:t>백업</w:t>
       </w:r>

</xml_diff>